<commit_message>
fix(catering-es-2.2): comida al 82 % (SPEC D4) y Tesorería sin «pan común»; landing: equilibrio en torno a 108 eventos
Mismos defectos que el m9 y el m8 del paellero, por la misma vía (a.py → ciclo.sh → cifras → docx):
neto año 1 39.297 → 39.540 €, DSCR 2,84 → 2,85, equilibrio 55 → 54 invitados/evento y 109 → 108 eventos/año
(caja 106 → 105), holgura de caja 23,7/24,3 → 23,8/24,4 %. Sin cambios: ventas 447.850 €, inversión 130.365 €
y préstamo. Gates del catering en verde (motor 13/13, D15, idempotencia, censo, no latinos, restos, prohibidos).
Paellero: la nota del ejemplo de empresa explica que el margen objetivo cambia por canal (autotest 336/336).
sha256 Mac = VPS en los 22 ficheros.

Via: Claude Code

Co-Authored-By: Claude Opus 5.5 <noreply@anthropic.com>
Claude-Session: https://claude.ai/code/session_01KriAdpMP6uaswtiVvqtBvP
</commit_message>
<xml_diff>
--- a/astro-site/public/dl/plan-catering-tematico-eventos/plan-de-negocio-catering-tematico-eventos.docx
+++ b/astro-site/public/dl/plan-catering-tematico-eventos/plan-de-negocio-catering-tematico-eventos.docx
@@ -330,7 +330,7 @@
     </w:p>
     <w:p>
       <w:r>
-        <w:t>En el primer año planificamos 130 eventos con 65 invitados de media, a 53 € por invitado sin IVA. Eso suma 447.850 € de ventas, que crecen hasta 501.592 € en el segundo año y 541.719 € en el tercero. El resultado neto del primer año es de 39.297 €, un 8,8 % de las ventas, y la cobertura mínima de la deuda durante el préstamo es de 2,84. En términos contables, el negocio llega al equilibrio con 109 eventos al año. Las bodas se reservan con meses de antelación y las empresas repiten, así que el calendario ofrece más visibilidad que la de un negocio de calle.</w:t>
+        <w:t>En el primer año planificamos 130 eventos con 65 invitados de media, a 53 € por invitado sin IVA. Eso suma 447.850 € de ventas, que crecen hasta 501.592 € en el segundo año y 541.719 € en el tercero. El resultado neto del primer año es de 39.540 €, un 8,8 % de las ventas, y la cobertura mínima de la deuda durante el préstamo es de 2,85. En términos contables, el negocio llega al equilibrio con 108 eventos al año. Las bodas se reservan con meses de antelación y las empresas repiten, así que el calendario ofrece más visibilidad que la de un negocio de calle.</w:t>
       </w:r>
     </w:p>
     <w:p>
@@ -414,7 +414,7 @@
     </w:p>
     <w:p>
       <w:r>
-        <w:t>En el caso de ejemplo, las empresas suponen el 65 % de los eventos y los particulares el resto, con menos eventos pero más grandes. Es una estimación del kit, no un dato de mercado. El calendario tampoco es uniforme: las bodas se concentran de mayo a octubre, las comuniones en mayo y la Navidad de empresa en diciembre, mientras que agosto y enero son los meses más flojos. En el Excel, el mes de menor saldo de caja es el 4, con 26.201 €. Tu calendario local será distinto, así que ajusta la curva a tu mes de apertura y sustituye los porcentajes por lo que te digan tus propias reservas.</w:t>
+        <w:t>En el caso de ejemplo, las empresas suponen el 65 % de los eventos y los particulares el resto, con menos eventos pero más grandes. Es una estimación del kit, no un dato de mercado. El calendario tampoco es uniforme: las bodas se concentran de mayo a octubre, las comuniones en mayo y la Navidad de empresa en diciembre, mientras que agosto y enero son los meses más flojos. En el Excel, el mes de menor saldo de caja es el 4, con 26.211 €. Tu calendario local será distinto, así que ajusta la curva a tu mes de apertura y sustituye los porcentajes por lo que te digan tus propias reservas.</w:t>
       </w:r>
     </w:p>
     <w:p>
@@ -424,7 +424,7 @@
     </w:p>
     <w:p>
       <w:r>
-        <w:t>La demanda tiene riesgos que el plan debe nombrar. La temporada de bodas es corta, y una primavera floja deja un hueco que el otoño no siempre compensa. Los clientes cancelan o reducen invitados a última hora, y por eso importan el anticipo y las condiciones de cancelación. El plan lo recoge en el escenario pesimista del Excel: 105 eventos y un resultado de -35.201 €.</w:t>
+        <w:t>La demanda tiene riesgos que el plan debe nombrar. La temporada de bodas es corta, y una primavera floja deja un hueco que el otoño no siempre compensa. Los clientes cancelan o reducen invitados a última hora, y por eso importan el anticipo y las condiciones de cancelación. El plan lo recoge en el escenario pesimista del Excel: 105 eventos y un resultado de -35.000 €.</w:t>
       </w:r>
     </w:p>
     <w:p>
@@ -634,7 +634,7 @@
     </w:p>
     <w:p>
       <w:r>
-        <w:t>En conjunto, el caso del kit describe un negocio pequeño y viable sobre el papel. Las ventas del primer año alcanzan 447.850 €, con un margen bruto de 61,3 % y un resultado neto de 39.297 €, es decir, un 8,8 % de las ventas. Son cifras de planificación del Excel de este kit, no una previsión. Se sostienen mientras los eventos al año, el precio por invitado y los invitados por evento sean realistas en tu zona, y las celdas verdes del Excel son el lugar donde los cambias.</w:t>
+        <w:t>En conjunto, el caso del kit describe un negocio pequeño y viable sobre el papel. Las ventas del primer año alcanzan 447.850 €, con un margen bruto de 61,4 % y un resultado neto de 39.540 €, es decir, un 8,8 % de las ventas. Son cifras de planificación del Excel de este kit, no una previsión. Se sostienen mientras los eventos al año, el precio por invitado y los invitados por evento sean realistas en tu zona, y las celdas verdes del Excel son el lugar donde los cambias.</w:t>
       </w:r>
     </w:p>
     <w:p>
@@ -644,27 +644,27 @@
     </w:p>
     <w:p>
       <w:r>
-        <w:t>Los ingresos crecen con el volumen, no con el precio: el Excel sube un 12 % y un 8 % los invitados por evento (de 65 a 72,8 y 78,6) con los mismos 130 eventos y el mismo precio, que en euros equivale a hacer más eventos del mismo tamaño. El caso pasa de 447.850 € en el primer año a 501.592 € en el segundo y 541.719 € en el tercero. El resultado neto acompaña: 39.297 €, 62.197 € y 69.778 €, después de intereses, amortizaciones e impuesto sobre beneficios. En el tercer año el neto llega a un 12,9 % de las ventas, un avance que viene del volumen y de repartir los costes fijos entre más eventos.</w:t>
+        <w:t>Los ingresos crecen con el volumen, no con el precio: el Excel sube un 12 % y un 8 % los invitados por evento (de 65 a 72,8 y 78,6) con los mismos 130 eventos y el mismo precio, que en euros equivale a hacer más eventos del mismo tamaño. El caso pasa de 447.850 € en el primer año a 501.592 € en el segundo y 541.719 € en el tercero. El resultado neto acompaña: 39.540 €, 62.469 € y 70.037 €, después de intereses, amortizaciones e impuesto sobre beneficios. En el tercer año el neto llega a un 12,9 % de las ventas, un avance que viene del volumen y de repartir los costes fijos entre más eventos.</w:t>
       </w:r>
     </w:p>
     <w:p>
       <w:r>
-        <w:t>Los costes se contrastan con rangos de referencia. La mercancía de comida pesa un 30 % y la de bebida, un 28 %; en conjunto la mercancía es un 29,7 % de las ventas, y el margen bruto, tras todos los costes variables, queda en un 61,3 %. El personal supone un 36,3 % y la cocina central, 24.000 € al año. Como referencia del kit (estimación), el catering de eventos se mueve con un food cost del 28-32 % y un personal del 33-38 % de las ventas, y las referencias sectoriales de margen neto en hostelería rondan el 7-8 %. Los umbrales del Excel son editables: ajústalos a tu carta y a tu mercado.</w:t>
+        <w:t>Los costes se contrastan con rangos de referencia. La mercancía de comida pesa un 30 % y la de bebida, un 28 %; en conjunto la mercancía es un 29,6 % de las ventas, y el margen bruto, tras todos los costes variables, queda en un 61,4 %. El personal supone un 36,3 % y la cocina central, 24.000 € al año. Como referencia del kit (estimación), el catering de eventos se mueve con un food cost del 28-32 % y un personal del 33-38 % de las ventas, y las referencias sectoriales de margen neto en hostelería rondan el 7-8 %. Los umbrales del Excel son editables: ajústalos a tu carta y a tu mercado.</w:t>
       </w:r>
     </w:p>
     <w:p>
       <w:r>
-        <w:t>El equilibrio se mide en invitados y en eventos. A nivel contable, el negocio cubre sus costes con 55 invitados por evento si cierras los 130 eventos del plan, o con 109 eventos al año con el evento medio de 65 invitados, lo que equivale a 372.427 € de ingresos. En caja el umbral baja a 106 eventos, porque la amortización cuenta como coste pero no como salida de dinero, y deja una holgura de 23,7 %. Ese umbral es el del primer año, que por la carencia solo paga intereses. Desde el segundo entra la devolución del principal y el equilibrio de caja sube a 403.673 €: el crecimiento previsto lo cubre con una holgura del 24,3 %, pero sin crecer harían falta unos 118 eventos de 65 invitados. Si estás muy por debajo de ese punto, sube el precio o el volumen antes de gastar más.</w:t>
+        <w:t>El equilibrio se mide en invitados y en eventos. A nivel contable, el negocio cubre sus costes con 54 invitados por evento si cierras los 130 eventos del plan, o con 108 eventos al año con el evento medio de 65 invitados, lo que equivale a 372.040 € de ingresos. En caja el umbral baja a 105 eventos, porque la amortización cuenta como coste pero no como salida de dinero, y deja una holgura de 23,8 %. Ese umbral es el del primer año, que por la carencia solo paga intereses. Desde el segundo entra la devolución del principal y el equilibrio de caja sube a 403.254 €: el crecimiento previsto lo cubre con una holgura del 24,4 %, pero sin crecer harían falta unos 118 eventos de 65 invitados. Si estás muy por debajo de ese punto, sube el precio o el volumen antes de gastar más.</w:t>
       </w:r>
     </w:p>
     <w:p>
       <w:r>
-        <w:t>Un catering puede fallar por la caja aunque el beneficio sea bueno. El Excel supone que los clientes pagan a 25 días de media que a los proveedores les pagas a 30 días y las nóminas cada mes. El saldo mínimo de tesorería es 26.201 €, en el mes 4; el DSCR mínimo es 2,84 y el payback, 2,0 años. El modelo no cuenta los anticipos: el 40 % que cobras al firmar mejora la caja, así que la hoja de Tesorería es el escenario prudente y la real será algo mejor.</w:t>
+        <w:t>Un catering puede fallar por la caja aunque el beneficio sea bueno. El Excel supone que los clientes pagan a 25 días de media que a los proveedores les pagas a 30 días y las nóminas cada mes. El saldo mínimo de tesorería es 26.211 €, en el mes 4; el DSCR mínimo es 2,85 y el payback, 2,0 años. El modelo no cuenta los anticipos: el 40 % que cobras al firmar mejora la caja, así que la hoja de Tesorería es el escenario prudente y la real será algo mejor.</w:t>
       </w:r>
     </w:p>
     <w:p>
       <w:r>
-        <w:t>Dos escenarios muestran lo rápido que se mueven los números. El pesimista supone 105 eventos, con menos invitados y un precio por invitado más bajo, y da ventas de 315.000 € y un neto de -35.201 €: pérdidas. Es el aviso honesto del plan: en un año flojo se pierde dinero y la caja puede apretar antes, así que conviene una línea de crédito o un fondo mayor. El optimista llega a 598.500 € con 150 eventos y un neto de 117.788 €. El modelo mantiene la plantilla del caso base; en un año flojo programarías menos horas, lo que suavizaría la pérdida sin eliminar el riesgo.</w:t>
+        <w:t>Dos escenarios muestran lo rápido que se mueven los números. El pesimista supone 105 eventos, con menos invitados y un precio por invitado más bajo, y da ventas de 315.000 € y un neto de -35.000 €: pérdidas. Es el aviso honesto del plan: en un año flojo se pierde dinero y la caja puede apretar antes, así que conviene una línea de crédito o un fondo mayor. El optimista llega a 598.500 € con 150 eventos y un neto de 118.113 €. El modelo mantiene la plantilla del caso base; en un año flojo programarías menos horas, lo que suavizaría la pérdida sin eliminar el riesgo.</w:t>
       </w:r>
     </w:p>
     <w:p>
@@ -738,7 +738,7 @@
     </w:p>
     <w:p>
       <w:r>
-        <w:t>El plan se sostiene por cómo está construido. No hay restaurante que alquilar ni local que reformar: solo tiempo en una cocina central autorizada y una furgoneta frigorífica en lugar de una flota. Dos motores de demanda se equilibran: las empresas llenan la semana con coffee breaks, cócteles, comidas y fiestas de Navidad, y los particulares llenan los fines de semana con bodas, comuniones y cumpleaños. Con las cifras del caso, el negocio factura 447.850 € el primer año, gana 39.297 € netos, tiene una holgura de 23,7 % sobre el equilibrio de caja del primer año, un DSCR mínimo de 2,84 y un payback de 2,0 años. Las estaciones temáticas en directo y las dietas especiales bien resueltas dan a la marca algo por lo que ser conocida y un precio que no depende del presupuesto más barato del mercado. Si pruebas los números con honestidad, puedes empezar con una inversión acotada y crecer evento a evento.</w:t>
+        <w:t>El plan se sostiene por cómo está construido. No hay restaurante que alquilar ni local que reformar: solo tiempo en una cocina central autorizada y una furgoneta frigorífica en lugar de una flota. Dos motores de demanda se equilibran: las empresas llenan la semana con coffee breaks, cócteles, comidas y fiestas de Navidad, y los particulares llenan los fines de semana con bodas, comuniones y cumpleaños. Con las cifras del caso, el negocio factura 447.850 € el primer año, gana 39.540 € netos, tiene una holgura de 23,8 % sobre el equilibrio de caja del primer año, un DSCR mínimo de 2,85 y un payback de 2,0 años. Las estaciones temáticas en directo y las dietas especiales bien resueltas dan a la marca algo por lo que ser conocida y un precio que no depende del presupuesto más barato del mercado. Si pruebas los números con honestidad, puedes empezar con una inversión acotada y crecer evento a evento.</w:t>
       </w:r>
     </w:p>
     <w:p>
@@ -763,7 +763,7 @@
     </w:p>
     <w:p>
       <w:r>
-        <w:t>A tres años vista, el plan es hacer crecer la base de empresas recurrentes, que alisa la semana y abarata el coste comercial de cada evento, mientras el volumen sube un 12 % en el segundo año y un 8 % en el tercero. Con ello las ventas llegan a 541.719 € y el neto a 69.778 €, que son 12,9 % de las ventas. Una segunda furgoneta tiene sentido cuando el calendario de la cocina y la caja lo permiten a la vez, y no antes. Una cocina propia es una decisión posterior, que solo se toma cuando tus horas en la cocina compartida estén siempre llenas y un alquiler propio cueste menos que las horas que pagas. Añade una estación temática nueva cuando se venda la anterior, no cuando apetezca. Cada paso se paga con la caja generada, de modo que el negocio no depende de préstamos mayores.</w:t>
+        <w:t>A tres años vista, el plan es hacer crecer la base de empresas recurrentes, que alisa la semana y abarata el coste comercial de cada evento, mientras el volumen sube un 12 % en el segundo año y un 8 % en el tercero. Con ello las ventas llegan a 541.719 € y el neto a 70.037 €, que son 12,9 % de las ventas. Una segunda furgoneta tiene sentido cuando el calendario de la cocina y la caja lo permiten a la vez, y no antes. Una cocina propia es una decisión posterior, que solo se toma cuando tus horas en la cocina compartida estén siempre llenas y un alquiler propio cueste menos que las horas que pagas. Añade una estación temática nueva cuando se venda la anterior, no cuando apetezca. Cada paso se paga con la caja generada, de modo que el negocio no depende de préstamos mayores.</w:t>
       </w:r>
     </w:p>
     <w:p>

</xml_diff>